<commit_message>
Replace foreign-flow HTML scrape with IDX's official GetStockSummary API
fetch_foreign_flow() previously regex-guessed net foreign buy/sell out of
the rendered idx.co.id trading-summary HTML table, which breaks whenever
the page markup changes. Switched to IDX's own TradingSummary/GetStockSummary
JSON endpoint (curl.exe to route around Cloudflare's TLS-fingerprint block,
same workaround already proven in bandar-broksum) and compute net flow as
sum((ForeignBuy - ForeignSell) * Close) across all listed stocks.
</commit_message>
<xml_diff>
--- a/DOCUMENTATION.docx
+++ b/DOCUMENTATION.docx
@@ -441,6 +441,14 @@
         </w:tc>
       </w:tr>
     </w:tbl>
+    <w:p>
+      <w:pPr>
+        <w:pStyle w:val="ListBullet"/>
+      </w:pPr>
+      <w:r>
+        <w:t>Foreign flow now sourced from IDX's official GetStockSummary JSON API instead of HTML-scraping the trading-summary page (more reliable, resistant to page redesigns).</w:t>
+      </w:r>
+    </w:p>
     <w:p>
       <w:pPr>
         <w:pStyle w:val="Heading1"/>
@@ -4248,6 +4256,20 @@
           <w:i w:val="0"/>
         </w:rPr>
         <w:t>If a ticker fails 3 consecutive times across scans, it is automatically removed from _active_universe to avoid wasting workers. This resets on the next universe validation (weekly).</w:t>
+      </w:r>
+    </w:p>
+    <w:p>
+      <w:pPr>
+        <w:pStyle w:val="Heading2"/>
+      </w:pPr>
+      <w:r>
+        <w:t>Foreign Flow (Net Buy/Sell)</w:t>
+      </w:r>
+    </w:p>
+    <w:p>
+      <w:pPr/>
+      <w:r>
+        <w:t>fetch_foreign_flow() now calls IDX's own TradingSummary/GetStockSummary JSON API directly (via curl.exe, same Cloudflare-bypass pattern used in the bandar-broksum project) instead of scraping and regex-guessing numbers out of the rendered IDX trading-summary HTML page. It sums (ForeignBuy - ForeignSell) x Close across every listed stock for the latest available trading day (walking back up to 5 calendar days over weekends/holidays), giving a market-wide net foreign flow in Rupiah billions. Result is cached for 30 minutes, same as before.</w:t>
       </w:r>
     </w:p>
     <w:p>

</xml_diff>

<commit_message>
Add GitHub Actions cron mode for free 24/7 operation
Adds --once and --outcomes CLI entrypoints so the scanner can run as a
stateless cron job instead of a persistent process, matching the pattern
used by idx-algo-signal-surya. scan.yml fires every 30 min during market
hours, outcomes.yml checks TP/SL/Pending/Expired once at 15:55 WIB.
Telegram/FRED config now prefers env vars (GitHub Actions secrets) over
the hardcoded fallback. Interactive Telegram commands remain local-only
since no process stays alive to listen for them in this mode.

Co-Authored-By: Claude Sonnet 5 <noreply@anthropic.com>
Claude-Session: https://claude.ai/code/session_01WLnEAipowSvPhxB6PLj8Bo
</commit_message>
<xml_diff>
--- a/DOCUMENTATION.docx
+++ b/DOCUMENTATION.docx
@@ -6927,6 +6927,100 @@
         <w:pStyle w:val="Heading1"/>
       </w:pPr>
       <w:r>
+        <w:t>Deployment: Running 24/7 for Free (GitHub Actions)</w:t>
+      </w:r>
+    </w:p>
+    <w:p>
+      <w:pPr/>
+      <w:r>
+        <w:t>Running idx_scanner.py locally (python idx_scanner.py, no flags) requires a machine that stays on continuously — it runs an infinite loop plus a background thread that long-polls Telegram for interactive commands (/scan, /detail, /backtest, etc.). That kind of always-alive process needs an always-on host, which free platforms don't sustainably provide (GitHub Actions caps individual jobs at 6h and isn't meant for daemons; Render/Railway free tiers sleep or expire).</w:t>
+      </w:r>
+    </w:p>
+    <w:p>
+      <w:pPr/>
+      <w:r>
+        <w:t>To get continuous, free, unattended operation instead, the scanner supports a run-once mode driven by scheduled GitHub Actions workflows — the same pattern used by the sibling project idx-algo-signal-surya.</w:t>
+      </w:r>
+    </w:p>
+    <w:p>
+      <w:pPr>
+        <w:pStyle w:val="Heading2"/>
+      </w:pPr>
+      <w:r>
+        <w:t>CLI flags</w:t>
+      </w:r>
+    </w:p>
+    <w:p>
+      <w:pPr/>
+      <w:r>
+        <w:t>python idx_scanner.py --once — runs init_database(), migrate_db_if_needed(), universe validation, then (if the market is open) a single _run_and_send() scan-and-notify cycle, then exits. Skips silently when the market is closed. Also runs check_and_save_outcomes() if invoked at/after 15:50 WIB.</w:t>
+      </w:r>
+    </w:p>
+    <w:p>
+      <w:pPr/>
+      <w:r>
+        <w:t>python idx_scanner.py --outcomes — runs init_database(), migrate_db_if_needed(), then check_and_save_outcomes() (TP1/SL/Pending/Expired resolution against the signals table), then exits.</w:t>
+      </w:r>
+    </w:p>
+    <w:p>
+      <w:pPr>
+        <w:pStyle w:val="Heading2"/>
+      </w:pPr>
+      <w:r>
+        <w:t>Workflows</w:t>
+      </w:r>
+    </w:p>
+    <w:p>
+      <w:pPr/>
+      <w:r>
+        <w:t>.github/workflows/scan.yml — cron "0,30 2-8 * * 1-5" (UTC) = every 30 minutes from 09:00 to 15:30 WIB, Monday-Friday. Runs `python idx_scanner.py --once`.</w:t>
+      </w:r>
+    </w:p>
+    <w:p>
+      <w:pPr/>
+      <w:r>
+        <w:t>.github/workflows/outcomes.yml — cron "55 8 * * 1-5" (UTC) = 15:55 WIB, Monday-Friday. Runs `python idx_scanner.py --outcomes`.</w:t>
+      </w:r>
+    </w:p>
+    <w:p>
+      <w:pPr/>
+      <w:r>
+        <w:t>Both workflows require repository secrets TELEGRAM_BOT_TOKEN and TELEGRAM_CHAT_ID (FRED_API_KEY optional) set under Settings -&gt; Secrets and variables -&gt; Actions. TELEGRAM_BOT_TOKEN/TELEGRAM_CHAT_ID/FRED_API_KEY in idx_scanner.py now read from environment variables first (os.environ.get), falling back to the hardcoded CONFIG values for local runs.</w:t>
+      </w:r>
+    </w:p>
+    <w:p>
+      <w:pPr>
+        <w:pStyle w:val="Heading2"/>
+      </w:pPr>
+      <w:r>
+        <w:t>State persistence</w:t>
+      </w:r>
+    </w:p>
+    <w:p>
+      <w:pPr/>
+      <w:r>
+        <w:t>scanner_history.db is gitignored and never committed. Since each workflow run is a fresh, stateless VM, the SQLite file is restored/saved across runs via actions/cache (key scanner-db-${{ github.run_id }}, restore-keys scanner-db-) — the same trick idx-algo-signal-surya uses for signal.log. Both scan.yml and outcomes.yml share the same cache key prefix so history/win-rate data accumulates across both workflows.</w:t>
+      </w:r>
+    </w:p>
+    <w:p>
+      <w:pPr>
+        <w:pStyle w:val="Heading2"/>
+      </w:pPr>
+      <w:r>
+        <w:t>Known limitation</w:t>
+      </w:r>
+    </w:p>
+    <w:p>
+      <w:pPr/>
+      <w:r>
+        <w:t>Interactive Telegram commands (/scan, /detail, /makro, /regime, /sectors, /history, /winrate, /top, /backtest, /holiday, /status, /setportfolio) are NOT available in GitHub Actions mode — handle_commands() is never started, since each cron run is a single process that scans and exits rather than a persistent listener. These commands only work when running `python idx_scanner.py` (no flags) locally as a long-lived process.</w:t>
+      </w:r>
+    </w:p>
+    <w:p>
+      <w:pPr>
+        <w:pStyle w:val="Heading1"/>
+      </w:pPr>
+      <w:r>
         <w:t>Known Limitations</w:t>
       </w:r>
     </w:p>

</xml_diff>